<commit_message>
Present Milestone 2 as a standalone experiment
</commit_message>
<xml_diff>
--- a/reports/all_photos_seed42/milestone2_report.docx
+++ b/reports/all_photos_seed42/milestone2_report.docx
@@ -1616,788 +1616,6 @@
         <w:pageBreakBefore/>
       </w:pPr>
       <w:r>
-        <w:t>Comparison with the earlier experiment</w:t>
-      </w:r>
-    </w:p>
-    <w:p>
-      <w:pPr/>
-      <w:r>
-        <w:t>Both experiments fine-tuned COCO-pretrained YOLOv8s for 50 epochs with the same input size, optimizer settings and seed. The expanded experiment uses more source photographs and more optimizer steps per epoch. Its training and test distributions both changed, so this comparison describes the completed experiments without isolating the effect of more training data.</w:t>
-      </w:r>
-    </w:p>
-    <w:tbl>
-      <w:tblPr>
-        <w:tblW w:type="auto" w:w="0"/>
-        <w:jc w:val="center"/>
-        <w:tblLayout w:type="fixed"/>
-        <w:tblLook w:firstColumn="1" w:firstRow="1" w:lastColumn="0" w:lastRow="0" w:noHBand="0" w:noVBand="1" w:val="04A0"/>
-        <w:tblBorders>
-          <w:top w:val="single" w:sz="4" w:color="D9D9D9"/>
-          <w:left w:val="single" w:sz="4" w:color="D9D9D9"/>
-          <w:bottom w:val="single" w:sz="4" w:color="D9D9D9"/>
-          <w:right w:val="single" w:sz="4" w:color="D9D9D9"/>
-          <w:insideH w:val="single" w:sz="4" w:color="D9D9D9"/>
-          <w:insideV w:val="single" w:sz="4" w:color="D9D9D9"/>
-        </w:tblBorders>
-      </w:tblPr>
-      <w:tblGrid>
-        <w:gridCol w:w="4752"/>
-        <w:gridCol w:w="2736"/>
-        <w:gridCol w:w="2736"/>
-      </w:tblGrid>
-      <w:tr>
-        <w:trPr>
-          <w:cantSplit/>
-          <w:tblHeader/>
-        </w:trPr>
-        <w:tc>
-          <w:tcPr>
-            <w:tcW w:type="dxa" w:w="4752"/>
-            <w:vAlign w:val="center"/>
-            <w:shd w:fill="162F46"/>
-            <w:tcMar>
-              <w:top w:w="75" w:type="dxa"/>
-              <w:bottom w:w="75" w:type="dxa"/>
-              <w:left w:w="100" w:type="dxa"/>
-              <w:right w:w="100" w:type="dxa"/>
-            </w:tcMar>
-          </w:tcPr>
-          <w:p>
-            <w:pPr>
-              <w:spacing w:after="0" w:line="252" w:lineRule="auto"/>
-            </w:pPr>
-            <w:r>
-              <w:rPr>
-                <w:b/>
-                <w:color w:val="FFFFFF"/>
-                <w:sz w:val="19"/>
-              </w:rPr>
-              <w:t>Measure</w:t>
-            </w:r>
-          </w:p>
-        </w:tc>
-        <w:tc>
-          <w:tcPr>
-            <w:tcW w:type="dxa" w:w="2736"/>
-            <w:vAlign w:val="center"/>
-            <w:shd w:fill="162F46"/>
-            <w:tcMar>
-              <w:top w:w="75" w:type="dxa"/>
-              <w:bottom w:w="75" w:type="dxa"/>
-              <w:left w:w="100" w:type="dxa"/>
-              <w:right w:w="100" w:type="dxa"/>
-            </w:tcMar>
-          </w:tcPr>
-          <w:p>
-            <w:pPr>
-              <w:spacing w:after="0" w:line="252" w:lineRule="auto"/>
-              <w:jc w:val="center"/>
-            </w:pPr>
-            <w:r>
-              <w:rPr>
-                <w:b/>
-                <w:color w:val="FFFFFF"/>
-                <w:sz w:val="19"/>
-              </w:rPr>
-              <w:t>Earlier subset</w:t>
-            </w:r>
-          </w:p>
-        </w:tc>
-        <w:tc>
-          <w:tcPr>
-            <w:tcW w:type="dxa" w:w="2736"/>
-            <w:vAlign w:val="center"/>
-            <w:shd w:fill="162F46"/>
-            <w:tcMar>
-              <w:top w:w="75" w:type="dxa"/>
-              <w:bottom w:w="75" w:type="dxa"/>
-              <w:left w:w="100" w:type="dxa"/>
-              <w:right w:w="100" w:type="dxa"/>
-            </w:tcMar>
-          </w:tcPr>
-          <w:p>
-            <w:pPr>
-              <w:spacing w:after="0" w:line="252" w:lineRule="auto"/>
-              <w:jc w:val="center"/>
-            </w:pPr>
-            <w:r>
-              <w:rPr>
-                <w:b/>
-                <w:color w:val="FFFFFF"/>
-                <w:sz w:val="19"/>
-              </w:rPr>
-              <w:t>Expanded dataset</w:t>
-            </w:r>
-          </w:p>
-        </w:tc>
-      </w:tr>
-      <w:tr>
-        <w:trPr>
-          <w:cantSplit/>
-        </w:trPr>
-        <w:tc>
-          <w:tcPr>
-            <w:tcW w:type="dxa" w:w="4752"/>
-            <w:vAlign w:val="center"/>
-            <w:shd w:fill="EFF4F7"/>
-            <w:tcMar>
-              <w:top w:w="75" w:type="dxa"/>
-              <w:bottom w:w="75" w:type="dxa"/>
-              <w:left w:w="100" w:type="dxa"/>
-              <w:right w:w="100" w:type="dxa"/>
-            </w:tcMar>
-          </w:tcPr>
-          <w:p>
-            <w:pPr>
-              <w:spacing w:after="0" w:line="252" w:lineRule="auto"/>
-            </w:pPr>
-            <w:r>
-              <w:rPr>
-                <w:b w:val="0"/>
-                <w:color w:val="000000"/>
-                <w:sz w:val="19"/>
-              </w:rPr>
-              <w:t>Unique source photos</w:t>
-            </w:r>
-          </w:p>
-        </w:tc>
-        <w:tc>
-          <w:tcPr>
-            <w:tcW w:type="dxa" w:w="2736"/>
-            <w:vAlign w:val="center"/>
-            <w:shd w:fill="EFF4F7"/>
-            <w:tcMar>
-              <w:top w:w="75" w:type="dxa"/>
-              <w:bottom w:w="75" w:type="dxa"/>
-              <w:left w:w="100" w:type="dxa"/>
-              <w:right w:w="100" w:type="dxa"/>
-            </w:tcMar>
-          </w:tcPr>
-          <w:p>
-            <w:pPr>
-              <w:spacing w:after="0" w:line="252" w:lineRule="auto"/>
-              <w:jc w:val="center"/>
-            </w:pPr>
-            <w:r>
-              <w:rPr>
-                <w:b w:val="0"/>
-                <w:color w:val="000000"/>
-                <w:sz w:val="19"/>
-              </w:rPr>
-              <w:t>365</w:t>
-            </w:r>
-          </w:p>
-        </w:tc>
-        <w:tc>
-          <w:tcPr>
-            <w:tcW w:type="dxa" w:w="2736"/>
-            <w:vAlign w:val="center"/>
-            <w:shd w:fill="EFF4F7"/>
-            <w:tcMar>
-              <w:top w:w="75" w:type="dxa"/>
-              <w:bottom w:w="75" w:type="dxa"/>
-              <w:left w:w="100" w:type="dxa"/>
-              <w:right w:w="100" w:type="dxa"/>
-            </w:tcMar>
-          </w:tcPr>
-          <w:p>
-            <w:pPr>
-              <w:spacing w:after="0" w:line="252" w:lineRule="auto"/>
-              <w:jc w:val="center"/>
-            </w:pPr>
-            <w:r>
-              <w:rPr>
-                <w:b w:val="0"/>
-                <w:color w:val="000000"/>
-                <w:sz w:val="19"/>
-              </w:rPr>
-              <w:t>6,933</w:t>
-            </w:r>
-          </w:p>
-        </w:tc>
-      </w:tr>
-      <w:tr>
-        <w:trPr>
-          <w:cantSplit/>
-        </w:trPr>
-        <w:tc>
-          <w:tcPr>
-            <w:tcW w:type="dxa" w:w="4752"/>
-            <w:vAlign w:val="center"/>
-            <w:shd w:fill="FFFFFF"/>
-            <w:tcMar>
-              <w:top w:w="75" w:type="dxa"/>
-              <w:bottom w:w="75" w:type="dxa"/>
-              <w:left w:w="100" w:type="dxa"/>
-              <w:right w:w="100" w:type="dxa"/>
-            </w:tcMar>
-          </w:tcPr>
-          <w:p>
-            <w:pPr>
-              <w:spacing w:after="0" w:line="252" w:lineRule="auto"/>
-            </w:pPr>
-            <w:r>
-              <w:rPr>
-                <w:b w:val="0"/>
-                <w:color w:val="000000"/>
-                <w:sz w:val="19"/>
-              </w:rPr>
-              <w:t>Training composites</w:t>
-            </w:r>
-          </w:p>
-        </w:tc>
-        <w:tc>
-          <w:tcPr>
-            <w:tcW w:type="dxa" w:w="2736"/>
-            <w:vAlign w:val="center"/>
-            <w:shd w:fill="FFFFFF"/>
-            <w:tcMar>
-              <w:top w:w="75" w:type="dxa"/>
-              <w:bottom w:w="75" w:type="dxa"/>
-              <w:left w:w="100" w:type="dxa"/>
-              <w:right w:w="100" w:type="dxa"/>
-            </w:tcMar>
-          </w:tcPr>
-          <w:p>
-            <w:pPr>
-              <w:spacing w:after="0" w:line="252" w:lineRule="auto"/>
-              <w:jc w:val="center"/>
-            </w:pPr>
-            <w:r>
-              <w:rPr>
-                <w:b w:val="0"/>
-                <w:color w:val="000000"/>
-                <w:sz w:val="19"/>
-              </w:rPr>
-              <w:t>1,168</w:t>
-            </w:r>
-          </w:p>
-        </w:tc>
-        <w:tc>
-          <w:tcPr>
-            <w:tcW w:type="dxa" w:w="2736"/>
-            <w:vAlign w:val="center"/>
-            <w:shd w:fill="FFFFFF"/>
-            <w:tcMar>
-              <w:top w:w="75" w:type="dxa"/>
-              <w:bottom w:w="75" w:type="dxa"/>
-              <w:left w:w="100" w:type="dxa"/>
-              <w:right w:w="100" w:type="dxa"/>
-            </w:tcMar>
-          </w:tcPr>
-          <w:p>
-            <w:pPr>
-              <w:spacing w:after="0" w:line="252" w:lineRule="auto"/>
-              <w:jc w:val="center"/>
-            </w:pPr>
-            <w:r>
-              <w:rPr>
-                <w:b w:val="0"/>
-                <w:color w:val="000000"/>
-                <w:sz w:val="19"/>
-              </w:rPr>
-              <w:t>8,000</w:t>
-            </w:r>
-          </w:p>
-        </w:tc>
-      </w:tr>
-      <w:tr>
-        <w:trPr>
-          <w:cantSplit/>
-        </w:trPr>
-        <w:tc>
-          <w:tcPr>
-            <w:tcW w:type="dxa" w:w="4752"/>
-            <w:vAlign w:val="center"/>
-            <w:shd w:fill="EFF4F7"/>
-            <w:tcMar>
-              <w:top w:w="75" w:type="dxa"/>
-              <w:bottom w:w="75" w:type="dxa"/>
-              <w:left w:w="100" w:type="dxa"/>
-              <w:right w:w="100" w:type="dxa"/>
-            </w:tcMar>
-          </w:tcPr>
-          <w:p>
-            <w:pPr>
-              <w:spacing w:after="0" w:line="252" w:lineRule="auto"/>
-            </w:pPr>
-            <w:r>
-              <w:rPr>
-                <w:b w:val="0"/>
-                <w:color w:val="000000"/>
-                <w:sz w:val="19"/>
-              </w:rPr>
-              <w:t>Test composites</w:t>
-            </w:r>
-          </w:p>
-        </w:tc>
-        <w:tc>
-          <w:tcPr>
-            <w:tcW w:type="dxa" w:w="2736"/>
-            <w:vAlign w:val="center"/>
-            <w:shd w:fill="EFF4F7"/>
-            <w:tcMar>
-              <w:top w:w="75" w:type="dxa"/>
-              <w:bottom w:w="75" w:type="dxa"/>
-              <w:left w:w="100" w:type="dxa"/>
-              <w:right w:w="100" w:type="dxa"/>
-            </w:tcMar>
-          </w:tcPr>
-          <w:p>
-            <w:pPr>
-              <w:spacing w:after="0" w:line="252" w:lineRule="auto"/>
-              <w:jc w:val="center"/>
-            </w:pPr>
-            <w:r>
-              <w:rPr>
-                <w:b w:val="0"/>
-                <w:color w:val="000000"/>
-                <w:sz w:val="19"/>
-              </w:rPr>
-              <w:t>146</w:t>
-            </w:r>
-          </w:p>
-        </w:tc>
-        <w:tc>
-          <w:tcPr>
-            <w:tcW w:type="dxa" w:w="2736"/>
-            <w:vAlign w:val="center"/>
-            <w:shd w:fill="EFF4F7"/>
-            <w:tcMar>
-              <w:top w:w="75" w:type="dxa"/>
-              <w:bottom w:w="75" w:type="dxa"/>
-              <w:left w:w="100" w:type="dxa"/>
-              <w:right w:w="100" w:type="dxa"/>
-            </w:tcMar>
-          </w:tcPr>
-          <w:p>
-            <w:pPr>
-              <w:spacing w:after="0" w:line="252" w:lineRule="auto"/>
-              <w:jc w:val="center"/>
-            </w:pPr>
-            <w:r>
-              <w:rPr>
-                <w:b w:val="0"/>
-                <w:color w:val="000000"/>
-                <w:sz w:val="19"/>
-              </w:rPr>
-              <w:t>1,000</w:t>
-            </w:r>
-          </w:p>
-        </w:tc>
-      </w:tr>
-      <w:tr>
-        <w:trPr>
-          <w:cantSplit/>
-        </w:trPr>
-        <w:tc>
-          <w:tcPr>
-            <w:tcW w:type="dxa" w:w="4752"/>
-            <w:vAlign w:val="center"/>
-            <w:shd w:fill="FFFFFF"/>
-            <w:tcMar>
-              <w:top w:w="75" w:type="dxa"/>
-              <w:bottom w:w="75" w:type="dxa"/>
-              <w:left w:w="100" w:type="dxa"/>
-              <w:right w:w="100" w:type="dxa"/>
-            </w:tcMar>
-          </w:tcPr>
-          <w:p>
-            <w:pPr>
-              <w:spacing w:after="0" w:line="252" w:lineRule="auto"/>
-            </w:pPr>
-            <w:r>
-              <w:rPr>
-                <w:b w:val="0"/>
-                <w:color w:val="000000"/>
-                <w:sz w:val="19"/>
-              </w:rPr>
-              <w:t>Test mAP50</w:t>
-            </w:r>
-          </w:p>
-        </w:tc>
-        <w:tc>
-          <w:tcPr>
-            <w:tcW w:type="dxa" w:w="2736"/>
-            <w:vAlign w:val="center"/>
-            <w:shd w:fill="FFFFFF"/>
-            <w:tcMar>
-              <w:top w:w="75" w:type="dxa"/>
-              <w:bottom w:w="75" w:type="dxa"/>
-              <w:left w:w="100" w:type="dxa"/>
-              <w:right w:w="100" w:type="dxa"/>
-            </w:tcMar>
-          </w:tcPr>
-          <w:p>
-            <w:pPr>
-              <w:spacing w:after="0" w:line="252" w:lineRule="auto"/>
-              <w:jc w:val="center"/>
-            </w:pPr>
-            <w:r>
-              <w:rPr>
-                <w:b w:val="0"/>
-                <w:color w:val="000000"/>
-                <w:sz w:val="19"/>
-              </w:rPr>
-              <w:t>71.31%</w:t>
-            </w:r>
-          </w:p>
-        </w:tc>
-        <w:tc>
-          <w:tcPr>
-            <w:tcW w:type="dxa" w:w="2736"/>
-            <w:vAlign w:val="center"/>
-            <w:shd w:fill="FFFFFF"/>
-            <w:tcMar>
-              <w:top w:w="75" w:type="dxa"/>
-              <w:bottom w:w="75" w:type="dxa"/>
-              <w:left w:w="100" w:type="dxa"/>
-              <w:right w:w="100" w:type="dxa"/>
-            </w:tcMar>
-          </w:tcPr>
-          <w:p>
-            <w:pPr>
-              <w:spacing w:after="0" w:line="252" w:lineRule="auto"/>
-              <w:jc w:val="center"/>
-            </w:pPr>
-            <w:r>
-              <w:rPr>
-                <w:b w:val="0"/>
-                <w:color w:val="000000"/>
-                <w:sz w:val="19"/>
-              </w:rPr>
-              <w:t>98.65%</w:t>
-            </w:r>
-          </w:p>
-        </w:tc>
-      </w:tr>
-      <w:tr>
-        <w:trPr>
-          <w:cantSplit/>
-        </w:trPr>
-        <w:tc>
-          <w:tcPr>
-            <w:tcW w:type="dxa" w:w="4752"/>
-            <w:vAlign w:val="center"/>
-            <w:shd w:fill="EFF4F7"/>
-            <w:tcMar>
-              <w:top w:w="75" w:type="dxa"/>
-              <w:bottom w:w="75" w:type="dxa"/>
-              <w:left w:w="100" w:type="dxa"/>
-              <w:right w:w="100" w:type="dxa"/>
-            </w:tcMar>
-          </w:tcPr>
-          <w:p>
-            <w:pPr>
-              <w:spacing w:after="0" w:line="252" w:lineRule="auto"/>
-            </w:pPr>
-            <w:r>
-              <w:rPr>
-                <w:b w:val="0"/>
-                <w:color w:val="000000"/>
-                <w:sz w:val="19"/>
-              </w:rPr>
-              <w:t>Test mAP50–95</w:t>
-            </w:r>
-          </w:p>
-        </w:tc>
-        <w:tc>
-          <w:tcPr>
-            <w:tcW w:type="dxa" w:w="2736"/>
-            <w:vAlign w:val="center"/>
-            <w:shd w:fill="EFF4F7"/>
-            <w:tcMar>
-              <w:top w:w="75" w:type="dxa"/>
-              <w:bottom w:w="75" w:type="dxa"/>
-              <w:left w:w="100" w:type="dxa"/>
-              <w:right w:w="100" w:type="dxa"/>
-            </w:tcMar>
-          </w:tcPr>
-          <w:p>
-            <w:pPr>
-              <w:spacing w:after="0" w:line="252" w:lineRule="auto"/>
-              <w:jc w:val="center"/>
-            </w:pPr>
-            <w:r>
-              <w:rPr>
-                <w:b w:val="0"/>
-                <w:color w:val="000000"/>
-                <w:sz w:val="19"/>
-              </w:rPr>
-              <w:t>57.85%</w:t>
-            </w:r>
-          </w:p>
-        </w:tc>
-        <w:tc>
-          <w:tcPr>
-            <w:tcW w:type="dxa" w:w="2736"/>
-            <w:vAlign w:val="center"/>
-            <w:shd w:fill="EFF4F7"/>
-            <w:tcMar>
-              <w:top w:w="75" w:type="dxa"/>
-              <w:bottom w:w="75" w:type="dxa"/>
-              <w:left w:w="100" w:type="dxa"/>
-              <w:right w:w="100" w:type="dxa"/>
-            </w:tcMar>
-          </w:tcPr>
-          <w:p>
-            <w:pPr>
-              <w:spacing w:after="0" w:line="252" w:lineRule="auto"/>
-              <w:jc w:val="center"/>
-            </w:pPr>
-            <w:r>
-              <w:rPr>
-                <w:b w:val="0"/>
-                <w:color w:val="000000"/>
-                <w:sz w:val="19"/>
-              </w:rPr>
-              <w:t>94.26%</w:t>
-            </w:r>
-          </w:p>
-        </w:tc>
-      </w:tr>
-      <w:tr>
-        <w:trPr>
-          <w:cantSplit/>
-        </w:trPr>
-        <w:tc>
-          <w:tcPr>
-            <w:tcW w:type="dxa" w:w="4752"/>
-            <w:vAlign w:val="center"/>
-            <w:shd w:fill="FFFFFF"/>
-            <w:tcMar>
-              <w:top w:w="75" w:type="dxa"/>
-              <w:bottom w:w="75" w:type="dxa"/>
-              <w:left w:w="100" w:type="dxa"/>
-              <w:right w:w="100" w:type="dxa"/>
-            </w:tcMar>
-          </w:tcPr>
-          <w:p>
-            <w:pPr>
-              <w:spacing w:after="0" w:line="252" w:lineRule="auto"/>
-            </w:pPr>
-            <w:r>
-              <w:rPr>
-                <w:b w:val="0"/>
-                <w:color w:val="000000"/>
-                <w:sz w:val="19"/>
-              </w:rPr>
-              <w:t>Test micro F1</w:t>
-            </w:r>
-          </w:p>
-        </w:tc>
-        <w:tc>
-          <w:tcPr>
-            <w:tcW w:type="dxa" w:w="2736"/>
-            <w:vAlign w:val="center"/>
-            <w:shd w:fill="FFFFFF"/>
-            <w:tcMar>
-              <w:top w:w="75" w:type="dxa"/>
-              <w:bottom w:w="75" w:type="dxa"/>
-              <w:left w:w="100" w:type="dxa"/>
-              <w:right w:w="100" w:type="dxa"/>
-            </w:tcMar>
-          </w:tcPr>
-          <w:p>
-            <w:pPr>
-              <w:spacing w:after="0" w:line="252" w:lineRule="auto"/>
-              <w:jc w:val="center"/>
-            </w:pPr>
-            <w:r>
-              <w:rPr>
-                <w:b w:val="0"/>
-                <w:color w:val="000000"/>
-                <w:sz w:val="19"/>
-              </w:rPr>
-              <w:t>0.6778</w:t>
-            </w:r>
-          </w:p>
-        </w:tc>
-        <w:tc>
-          <w:tcPr>
-            <w:tcW w:type="dxa" w:w="2736"/>
-            <w:vAlign w:val="center"/>
-            <w:shd w:fill="FFFFFF"/>
-            <w:tcMar>
-              <w:top w:w="75" w:type="dxa"/>
-              <w:bottom w:w="75" w:type="dxa"/>
-              <w:left w:w="100" w:type="dxa"/>
-              <w:right w:w="100" w:type="dxa"/>
-            </w:tcMar>
-          </w:tcPr>
-          <w:p>
-            <w:pPr>
-              <w:spacing w:after="0" w:line="252" w:lineRule="auto"/>
-              <w:jc w:val="center"/>
-            </w:pPr>
-            <w:r>
-              <w:rPr>
-                <w:b w:val="0"/>
-                <w:color w:val="000000"/>
-                <w:sz w:val="19"/>
-              </w:rPr>
-              <w:t>0.9829</w:t>
-            </w:r>
-          </w:p>
-        </w:tc>
-      </w:tr>
-      <w:tr>
-        <w:trPr>
-          <w:cantSplit/>
-        </w:trPr>
-        <w:tc>
-          <w:tcPr>
-            <w:tcW w:type="dxa" w:w="4752"/>
-            <w:vAlign w:val="center"/>
-            <w:shd w:fill="EFF4F7"/>
-            <w:tcMar>
-              <w:top w:w="75" w:type="dxa"/>
-              <w:bottom w:w="75" w:type="dxa"/>
-              <w:left w:w="100" w:type="dxa"/>
-              <w:right w:w="100" w:type="dxa"/>
-            </w:tcMar>
-          </w:tcPr>
-          <w:p>
-            <w:pPr>
-              <w:spacing w:after="0" w:line="252" w:lineRule="auto"/>
-            </w:pPr>
-            <w:r>
-              <w:rPr>
-                <w:b w:val="0"/>
-                <w:color w:val="000000"/>
-                <w:sz w:val="19"/>
-              </w:rPr>
-              <w:t>All objects correct</w:t>
-            </w:r>
-          </w:p>
-        </w:tc>
-        <w:tc>
-          <w:tcPr>
-            <w:tcW w:type="dxa" w:w="2736"/>
-            <w:vAlign w:val="center"/>
-            <w:shd w:fill="EFF4F7"/>
-            <w:tcMar>
-              <w:top w:w="75" w:type="dxa"/>
-              <w:bottom w:w="75" w:type="dxa"/>
-              <w:left w:w="100" w:type="dxa"/>
-              <w:right w:w="100" w:type="dxa"/>
-            </w:tcMar>
-          </w:tcPr>
-          <w:p>
-            <w:pPr>
-              <w:spacing w:after="0" w:line="252" w:lineRule="auto"/>
-              <w:jc w:val="center"/>
-            </w:pPr>
-            <w:r>
-              <w:rPr>
-                <w:b w:val="0"/>
-                <w:color w:val="000000"/>
-                <w:sz w:val="19"/>
-              </w:rPr>
-              <w:t>21.23%</w:t>
-            </w:r>
-          </w:p>
-        </w:tc>
-        <w:tc>
-          <w:tcPr>
-            <w:tcW w:type="dxa" w:w="2736"/>
-            <w:vAlign w:val="center"/>
-            <w:shd w:fill="EFF4F7"/>
-            <w:tcMar>
-              <w:top w:w="75" w:type="dxa"/>
-              <w:bottom w:w="75" w:type="dxa"/>
-              <w:left w:w="100" w:type="dxa"/>
-              <w:right w:w="100" w:type="dxa"/>
-            </w:tcMar>
-          </w:tcPr>
-          <w:p>
-            <w:pPr>
-              <w:spacing w:after="0" w:line="252" w:lineRule="auto"/>
-              <w:jc w:val="center"/>
-            </w:pPr>
-            <w:r>
-              <w:rPr>
-                <w:b w:val="0"/>
-                <w:color w:val="000000"/>
-                <w:sz w:val="19"/>
-              </w:rPr>
-              <w:t>92.90%</w:t>
-            </w:r>
-          </w:p>
-        </w:tc>
-      </w:tr>
-    </w:tbl>
-    <w:p>
-      <w:pPr>
-        <w:spacing w:after="0" w:before="0" w:line="80" w:lineRule="exact"/>
-      </w:pPr>
-      <w:r>
-        <w:rPr>
-          <w:sz w:val="8"/>
-        </w:rPr>
-      </w:r>
-    </w:p>
-    <w:p>
-      <w:pPr/>
-      <w:r>
-        <w:t>Expanded-data test mAP50–95 is 36.41 percentage points higher than the earlier result. Each experiment chose its operating threshold on its own validation set. A controlled follow-up would evaluate both saved models on the same independently annotated real-scene test set.</w:t>
-      </w:r>
-    </w:p>
-    <w:p>
-      <w:pPr>
-        <w:keepNext w:val="0"/>
-        <w:spacing w:after="100"/>
-        <w:jc w:val="center"/>
-      </w:pPr>
-      <w:r>
-        <w:drawing>
-          <wp:inline xmlns:a="http://schemas.openxmlformats.org/drawingml/2006/main" xmlns:pic="http://schemas.openxmlformats.org/drawingml/2006/picture">
-            <wp:extent cx="6217920" cy="2926080"/>
-            <wp:docPr id="6" name="Picture 6" descr="experiment comparison.png"/>
-            <wp:cNvGraphicFramePr>
-              <a:graphicFrameLocks noChangeAspect="1"/>
-            </wp:cNvGraphicFramePr>
-            <a:graphic>
-              <a:graphicData uri="http://schemas.openxmlformats.org/drawingml/2006/picture">
-                <pic:pic>
-                  <pic:nvPicPr>
-                    <pic:cNvPr id="0" name="experiment_comparison.png"/>
-                    <pic:cNvPicPr/>
-                  </pic:nvPicPr>
-                  <pic:blipFill>
-                    <a:blip r:embed="rId15"/>
-                    <a:stretch>
-                      <a:fillRect/>
-                    </a:stretch>
-                  </pic:blipFill>
-                  <pic:spPr>
-                    <a:xfrm>
-                      <a:off x="0" y="0"/>
-                      <a:ext cx="6217920" cy="2926080"/>
-                    </a:xfrm>
-                    <a:prstGeom prst="rect"/>
-                  </pic:spPr>
-                </pic:pic>
-              </a:graphicData>
-            </a:graphic>
-          </wp:inline>
-        </w:drawing>
-      </w:r>
-    </w:p>
-    <w:p>
-      <w:pPr>
-        <w:pStyle w:val="Caption"/>
-      </w:pPr>
-      <w:r>
-        <w:t>AP scores summarize precision–recall curves. Micro F1 and all-objects scores use each run’s validation-selected confidence threshold.</w:t>
-      </w:r>
-    </w:p>
-    <w:p>
-      <w:pPr>
-        <w:pStyle w:val="Heading1"/>
-        <w:pageBreakBefore/>
-      </w:pPr>
-      <w:r>
         <w:t>Final assessment and reproducibility</w:t>
       </w:r>
     </w:p>
@@ -2945,7 +2163,7 @@
       <w:r>
         <w:t xml:space="preserve">GitHub repository: </w:t>
       </w:r>
-      <w:hyperlink r:id="rId16">
+      <w:hyperlink r:id="rId15">
         <w:r>
           <w:rPr>
             <w:color w:val="0563C1"/>
@@ -2980,7 +2198,7 @@
       <w:pPr>
         <w:pStyle w:val="Caption"/>
       </w:pPr>
-      <w:hyperlink r:id="rId17">
+      <w:hyperlink r:id="rId16">
         <w:r>
           <w:rPr>
             <w:color w:val="0563C1"/>
@@ -2993,7 +2211,7 @@
       <w:pPr>
         <w:pStyle w:val="Caption"/>
       </w:pPr>
-      <w:hyperlink r:id="rId18">
+      <w:hyperlink r:id="rId17">
         <w:r>
           <w:rPr>
             <w:color w:val="0563C1"/>
@@ -3006,7 +2224,7 @@
       <w:pPr>
         <w:pStyle w:val="Caption"/>
       </w:pPr>
-      <w:hyperlink r:id="rId19">
+      <w:hyperlink r:id="rId18">
         <w:r>
           <w:rPr>
             <w:color w:val="0563C1"/>
@@ -3019,7 +2237,7 @@
       <w:pPr>
         <w:pStyle w:val="Caption"/>
       </w:pPr>
-      <w:hyperlink r:id="rId20">
+      <w:hyperlink r:id="rId19">
         <w:r>
           <w:rPr>
             <w:color w:val="0563C1"/>
@@ -3032,7 +2250,7 @@
       <w:pPr>
         <w:pStyle w:val="Caption"/>
       </w:pPr>
-      <w:hyperlink r:id="rId21">
+      <w:hyperlink r:id="rId20">
         <w:r>
           <w:rPr>
             <w:color w:val="0563C1"/>

</xml_diff>